<commit_message>
Update short version of the Harvard CV.
</commit_message>
<xml_diff>
--- a/cv-harvard/cv-flcanellas-sv.docx
+++ b/cv-harvard/cv-flcanellas-sv.docx
@@ -217,17 +217,20 @@
     <w:p>
       <w:pPr>
         <w:pStyle w:val="BodyText"/>
-        <w:spacing w:before="91" w:after="0"/>
+        <w:spacing w:before="0" w:after="0"/>
         <w:ind w:right="1"/>
         <w:jc w:val="center"/>
         <w:rPr>
-          <w:rStyle w:val="Hyperlink"/>
           <w:rFonts w:ascii="Calibri" w:hAnsi="Calibri" w:cs="Calibri"/>
-        </w:rPr>
-      </w:pPr>
-      <w:r>
-        <w:rPr>
-          <w:rFonts w:cs="Calibri" w:ascii="Calibri" w:hAnsi="Calibri"/>
+          <w:sz w:val="20"/>
+          <w:szCs w:val="20"/>
+        </w:rPr>
+      </w:pPr>
+      <w:r>
+        <w:rPr>
+          <w:rFonts w:cs="Calibri" w:ascii="Calibri" w:hAnsi="Calibri"/>
+          <w:sz w:val="20"/>
+          <w:szCs w:val="20"/>
         </w:rPr>
       </w:r>
     </w:p>
@@ -245,7 +248,19 @@
         <w:rPr>
           <w:rFonts w:ascii="Calibri" w:hAnsi="Calibri"/>
         </w:rPr>
-        <w:t>Ingeniero en Informática enfocado en el desarrollo Full Stack, automatización de procesos y seguridad en aplicaciones web. Experiencia práctica como desarrollador independiente y consultor técnico, resolviendo problemas cotidianos de rendimiento en backend, reestructuración de código heredado y desarrollo de herramientas a medida. Enfocado en la implementación de código seguro siguiendo los estándares y guías de desarrollo de OWASP, junto con la aplicación de configuraciones perimetrales en servidores, buscando siempre que el software en producción sea estable, eficiente y seguro.</w:t>
+        <w:t xml:space="preserve">Ingeniero en Informática enfocado en el desarrollo Full Stack, automatización de procesos y seguridad en aplicaciones web. Experiencia práctica como desarrollador independiente y consultor técnico, resolviendo problemas cotidianos de rendimiento en backend, reestructuración de código heredado y desarrollo de herramientas a medida. Enfocado en la implementación de código seguro </w:t>
+      </w:r>
+      <w:r>
+        <w:rPr>
+          <w:rFonts w:ascii="Calibri" w:hAnsi="Calibri"/>
+        </w:rPr>
+        <w:t xml:space="preserve">y en </w:t>
+      </w:r>
+      <w:r>
+        <w:rPr>
+          <w:rFonts w:ascii="Calibri" w:hAnsi="Calibri"/>
+        </w:rPr>
+        <w:t>la aplicación de configuraciones perimetrales en servidores.</w:t>
       </w:r>
     </w:p>
     <w:p>
@@ -269,7 +284,7 @@
     <w:p>
       <w:pPr>
         <w:pStyle w:val="Heading1"/>
-        <w:jc w:val="center"/>
+        <w:jc w:val="left"/>
         <w:rPr>
           <w:rFonts w:ascii="Calibri" w:hAnsi="Calibri"/>
         </w:rPr>
@@ -279,6 +294,24 @@
           <w:rFonts w:cs="Calibri" w:ascii="Calibri" w:hAnsi="Calibri"/>
         </w:rPr>
         <w:t>Educación</w:t>
+      </w:r>
+    </w:p>
+    <w:p>
+      <w:pPr>
+        <w:pStyle w:val="Heading1"/>
+        <w:jc w:val="left"/>
+        <w:rPr>
+          <w:rFonts w:ascii="Calibri" w:hAnsi="Calibri" w:cs="Calibri"/>
+          <w:sz w:val="20"/>
+          <w:szCs w:val="20"/>
+        </w:rPr>
+      </w:pPr>
+      <w:r>
+        <w:rPr>
+          <w:rFonts w:cs="Calibri" w:ascii="Calibri" w:hAnsi="Calibri"/>
+          <w:sz w:val="20"/>
+          <w:szCs w:val="20"/>
+        </w:rPr>
       </w:r>
     </w:p>
     <w:tbl>
@@ -295,9 +328,9 @@
         </w:tblCellMar>
       </w:tblPr>
       <w:tblGrid>
-        <w:gridCol w:w="3171"/>
+        <w:gridCol w:w="3170"/>
         <w:gridCol w:w="3515"/>
-        <w:gridCol w:w="4290"/>
+        <w:gridCol w:w="4291"/>
       </w:tblGrid>
       <w:tr>
         <w:trPr>
@@ -305,7 +338,7 @@
         </w:trPr>
         <w:tc>
           <w:tcPr>
-            <w:tcW w:w="3171" w:type="dxa"/>
+            <w:tcW w:w="3170" w:type="dxa"/>
             <w:tcBorders/>
           </w:tcPr>
           <w:p>
@@ -359,7 +392,7 @@
         </w:tc>
         <w:tc>
           <w:tcPr>
-            <w:tcW w:w="4290" w:type="dxa"/>
+            <w:tcW w:w="4291" w:type="dxa"/>
             <w:tcBorders/>
           </w:tcPr>
           <w:p>
@@ -392,7 +425,7 @@
         </w:trPr>
         <w:tc>
           <w:tcPr>
-            <w:tcW w:w="3171" w:type="dxa"/>
+            <w:tcW w:w="3170" w:type="dxa"/>
             <w:tcBorders/>
           </w:tcPr>
           <w:p>
@@ -448,7 +481,7 @@
         </w:tc>
         <w:tc>
           <w:tcPr>
-            <w:tcW w:w="4290" w:type="dxa"/>
+            <w:tcW w:w="4291" w:type="dxa"/>
             <w:tcBorders/>
           </w:tcPr>
           <w:p>
@@ -483,7 +516,7 @@
         </w:trPr>
         <w:tc>
           <w:tcPr>
-            <w:tcW w:w="3171" w:type="dxa"/>
+            <w:tcW w:w="3170" w:type="dxa"/>
             <w:tcBorders/>
           </w:tcPr>
           <w:p>
@@ -541,7 +574,7 @@
         </w:tc>
         <w:tc>
           <w:tcPr>
-            <w:tcW w:w="4290" w:type="dxa"/>
+            <w:tcW w:w="4291" w:type="dxa"/>
             <w:tcBorders/>
           </w:tcPr>
           <w:p>
@@ -584,7 +617,7 @@
         </w:trPr>
         <w:tc>
           <w:tcPr>
-            <w:tcW w:w="3171" w:type="dxa"/>
+            <w:tcW w:w="3170" w:type="dxa"/>
             <w:tcBorders/>
           </w:tcPr>
           <w:p>
@@ -638,7 +671,7 @@
         </w:tc>
         <w:tc>
           <w:tcPr>
-            <w:tcW w:w="4290" w:type="dxa"/>
+            <w:tcW w:w="4291" w:type="dxa"/>
             <w:tcBorders/>
           </w:tcPr>
           <w:p>
@@ -677,7 +710,7 @@
         </w:trPr>
         <w:tc>
           <w:tcPr>
-            <w:tcW w:w="3171" w:type="dxa"/>
+            <w:tcW w:w="3170" w:type="dxa"/>
             <w:tcBorders/>
           </w:tcPr>
           <w:p>
@@ -731,29 +764,13 @@
                 <w:b w:val="false"/>
                 <w:bCs w:val="false"/>
               </w:rPr>
-              <w:t xml:space="preserve">Python Essentials </w:t>
-            </w:r>
-            <w:r>
-              <w:rPr>
-                <w:rFonts w:ascii="Calibri" w:hAnsi="Calibri"/>
-                <w:b w:val="false"/>
-                <w:bCs w:val="false"/>
-              </w:rPr>
-              <w:t xml:space="preserve">1 y </w:t>
-            </w:r>
-            <w:r>
-              <w:rPr>
-                <w:rFonts w:ascii="Calibri" w:hAnsi="Calibri"/>
-                <w:b w:val="false"/>
-                <w:bCs w:val="false"/>
-              </w:rPr>
-              <w:t>2</w:t>
+              <w:t>Python Essentials 1 y 2</w:t>
             </w:r>
           </w:p>
         </w:tc>
         <w:tc>
           <w:tcPr>
-            <w:tcW w:w="4290" w:type="dxa"/>
+            <w:tcW w:w="4291" w:type="dxa"/>
             <w:tcBorders/>
           </w:tcPr>
           <w:p>
@@ -788,7 +805,7 @@
         <w:trPr/>
         <w:tc>
           <w:tcPr>
-            <w:tcW w:w="3171" w:type="dxa"/>
+            <w:tcW w:w="3170" w:type="dxa"/>
             <w:tcBorders/>
           </w:tcPr>
           <w:p>
@@ -842,7 +859,7 @@
         </w:tc>
         <w:tc>
           <w:tcPr>
-            <w:tcW w:w="4290" w:type="dxa"/>
+            <w:tcW w:w="4291" w:type="dxa"/>
             <w:tcBorders/>
           </w:tcPr>
           <w:p>
@@ -896,8 +913,8 @@
           <w:tab w:val="clear" w:pos="720"/>
           <w:tab w:val="left" w:pos="9432" w:leader="none"/>
         </w:tabs>
-        <w:ind w:left="119"/>
-        <w:jc w:val="center"/>
+        <w:ind w:hanging="0" w:left="0"/>
+        <w:jc w:val="left"/>
         <w:rPr>
           <w:rFonts w:ascii="Calibri" w:hAnsi="Calibri"/>
         </w:rPr>
@@ -1026,34 +1043,7 @@
           <w:rFonts w:cs="Calibri" w:ascii="Calibri" w:hAnsi="Calibri"/>
           <w:b/>
         </w:rPr>
-        <w:t xml:space="preserve">Desarrollador </w:t>
-      </w:r>
-      <w:r>
-        <w:rPr>
-          <w:rFonts w:cs="Calibri" w:ascii="Calibri" w:hAnsi="Calibri"/>
-          <w:b/>
-        </w:rPr>
-        <w:t>PHP</w:t>
-      </w:r>
-      <w:r>
-        <w:rPr>
-          <w:rFonts w:cs="Calibri" w:ascii="Calibri" w:hAnsi="Calibri"/>
-          <w:b/>
-        </w:rPr>
-        <w:t xml:space="preserve"> Full Stack - </w:t>
-      </w:r>
-      <w:r>
-        <w:rPr>
-          <w:rFonts w:cs="Calibri" w:ascii="Calibri" w:hAnsi="Calibri"/>
-          <w:b/>
-        </w:rPr>
-        <w:t>Wordpress/WooCommerce</w:t>
-      </w:r>
-      <w:r>
-        <w:rPr>
-          <w:rFonts w:cs="Calibri" w:ascii="Calibri" w:hAnsi="Calibri"/>
-          <w:b/>
-        </w:rPr>
+        <w:t>Desarrollador PHP Full Stack - Wordpress/WooCommerce</w:t>
         <w:tab/>
         <w:t xml:space="preserve"> </w:t>
       </w:r>
@@ -1202,15 +1192,7 @@
           <w:b/>
           <w:bCs/>
         </w:rPr>
-        <w:t xml:space="preserve">Consultor </w:t>
-      </w:r>
-      <w:r>
-        <w:rPr>
-          <w:rFonts w:ascii="Calibri" w:hAnsi="Calibri"/>
-          <w:b/>
-          <w:bCs/>
-        </w:rPr>
-        <w:t>Técnico Externo</w:t>
+        <w:t>Consultor Técnico Externo</w:t>
       </w:r>
       <w:r>
         <w:rPr>
@@ -1244,23 +1226,7 @@
           <w:b w:val="false"/>
           <w:bCs w:val="false"/>
         </w:rPr>
-        <w:t>I</w:t>
-      </w:r>
-      <w:r>
-        <w:rPr>
-          <w:rFonts w:cs="Calibri" w:ascii="Calibri" w:hAnsi="Calibri"/>
-          <w:b w:val="false"/>
-          <w:bCs w:val="false"/>
-        </w:rPr>
-        <w:t>mplementó</w:t>
-      </w:r>
-      <w:r>
-        <w:rPr>
-          <w:rFonts w:cs="Calibri" w:ascii="Calibri" w:hAnsi="Calibri"/>
-          <w:b w:val="false"/>
-          <w:bCs w:val="false"/>
-        </w:rPr>
-        <w:t xml:space="preserve"> </w:t>
+        <w:t xml:space="preserve">Implementó </w:t>
       </w:r>
       <w:r>
         <w:rPr>
@@ -1433,19 +1399,7 @@
         <w:rPr>
           <w:rFonts w:ascii="Calibri" w:hAnsi="Calibri"/>
         </w:rPr>
-        <w:t xml:space="preserve"> para asegurar la concurrencia del sistema de alarmas, y desarrolló un módulo de emulación para el sensor AHTX</w:t>
-      </w:r>
-      <w:r>
-        <w:rPr>
-          <w:rFonts w:ascii="Calibri" w:hAnsi="Calibri"/>
-        </w:rPr>
-        <w:t>0</w:t>
-      </w:r>
-      <w:r>
-        <w:rPr>
-          <w:rFonts w:ascii="Calibri" w:hAnsi="Calibri"/>
-        </w:rPr>
-        <w:t xml:space="preserve"> que permite conmutar dinámicamente entre lecturas reales y simuladas sin depender de hardware físico.</w:t>
+        <w:t xml:space="preserve"> para asegurar la concurrencia del sistema de alarmas, y desarrolló un módulo de emulación para el sensor AHTX0 que permite conmutar dinámicamente entre lecturas reales y simuladas sin depender de hardware físico.</w:t>
       </w:r>
     </w:p>
     <w:p>
@@ -2871,32 +2825,13 @@
           <w:rFonts w:cs="Calibri" w:ascii="Calibri" w:hAnsi="Calibri"/>
           <w:b/>
         </w:rPr>
-        <w:t>Tecnologías</w:t>
-      </w:r>
-      <w:r>
-        <w:rPr>
-          <w:rFonts w:cs="Calibri" w:ascii="Calibri" w:hAnsi="Calibri"/>
-          <w:b/>
-        </w:rPr>
-        <w:t>:</w:t>
-      </w:r>
-      <w:r>
-        <w:rPr>
-          <w:rFonts w:cs="Calibri" w:ascii="Calibri" w:hAnsi="Calibri"/>
-        </w:rPr>
-        <w:t xml:space="preserve"> PHP (WordPress Core, Laravel), Python, JavaScript / TypeScript (ES6+), </w:t>
-      </w:r>
-      <w:r>
-        <w:rPr>
-          <w:rFonts w:cs="Calibri" w:ascii="Calibri" w:hAnsi="Calibri"/>
-        </w:rPr>
-        <w:t xml:space="preserve">Vue.js, Vite, Tailwind CSS, </w:t>
-      </w:r>
-      <w:r>
-        <w:rPr>
-          <w:rFonts w:cs="Calibri" w:ascii="Calibri" w:hAnsi="Calibri"/>
-        </w:rPr>
-        <w:t>Bash.</w:t>
+        <w:t>Tecnologías:</w:t>
+      </w:r>
+      <w:r>
+        <w:rPr>
+          <w:rFonts w:cs="Calibri" w:ascii="Calibri" w:hAnsi="Calibri"/>
+        </w:rPr>
+        <w:t xml:space="preserve"> PHP (WordPress Core, Laravel), Python, JavaScript / TypeScript (ES6+), Vue.js, Vite, Tailwind CSS, Bash.</w:t>
       </w:r>
     </w:p>
     <w:p>
@@ -3829,15 +3764,15 @@
       <w:u w:val="single"/>
     </w:rPr>
   </w:style>
-  <w:style w:type="character" w:styleId="Bolos">
-    <w:name w:val="Bolos"/>
+  <w:style w:type="character" w:styleId="Bolosuser">
+    <w:name w:val="Bolos (user)"/>
     <w:qFormat/>
     <w:rPr>
       <w:rFonts w:ascii="OpenSymbol" w:hAnsi="OpenSymbol" w:eastAsia="OpenSymbol" w:cs="OpenSymbol"/>
     </w:rPr>
   </w:style>
-  <w:style w:type="character" w:styleId="Textooriginal">
-    <w:name w:val="Texto original"/>
+  <w:style w:type="character" w:styleId="Textooriginaluser">
+    <w:name w:val="Texto original (user)"/>
     <w:qFormat/>
     <w:rPr>
       <w:rFonts w:ascii="Liberation Mono" w:hAnsi="Liberation Mono" w:eastAsia="Liberation Mono" w:cs="Liberation Mono"/>
@@ -3947,15 +3882,15 @@
     <w:pPr/>
     <w:rPr/>
   </w:style>
-  <w:style w:type="paragraph" w:styleId="Cabeceraypieuser">
-    <w:name w:val="Cabecera y pie (user)"/>
+  <w:style w:type="paragraph" w:styleId="Cabeceraypie">
+    <w:name w:val="Cabecera y pie"/>
     <w:basedOn w:val="Normal"/>
     <w:qFormat/>
     <w:pPr/>
     <w:rPr/>
   </w:style>
-  <w:style w:type="paragraph" w:styleId="Cabeceraypie">
-    <w:name w:val="Cabecera y pie"/>
+  <w:style w:type="paragraph" w:styleId="Cabeceraypieuser">
+    <w:name w:val="Cabecera y pie (user)"/>
     <w:basedOn w:val="Normal"/>
     <w:qFormat/>
     <w:pPr/>
@@ -4015,6 +3950,16 @@
       <w:lang w:val="en-US" w:eastAsia="en-US" w:bidi="ar-SA"/>
     </w:rPr>
   </w:style>
+  <w:style w:type="paragraph" w:styleId="Contenidodelatabla">
+    <w:name w:val="Contenido de la tabla"/>
+    <w:basedOn w:val="Normal"/>
+    <w:qFormat/>
+    <w:pPr>
+      <w:widowControl w:val="false"/>
+      <w:suppressLineNumbers/>
+    </w:pPr>
+    <w:rPr/>
+  </w:style>
   <w:style w:type="paragraph" w:styleId="Contenidodelatablauser">
     <w:name w:val="Contenido de la tabla (user)"/>
     <w:basedOn w:val="Normal"/>
@@ -4025,19 +3970,9 @@
     </w:pPr>
     <w:rPr/>
   </w:style>
-  <w:style w:type="paragraph" w:styleId="Contenidodelatabla">
-    <w:name w:val="Contenido de la tabla"/>
-    <w:basedOn w:val="Normal"/>
-    <w:qFormat/>
-    <w:pPr>
-      <w:widowControl w:val="false"/>
-      <w:suppressLineNumbers/>
-    </w:pPr>
-    <w:rPr/>
-  </w:style>
-  <w:style w:type="paragraph" w:styleId="Ttulodelatabla">
-    <w:name w:val="Título de la tabla"/>
-    <w:basedOn w:val="Contenidodelatabla"/>
+  <w:style w:type="paragraph" w:styleId="Ttulodelatablauser">
+    <w:name w:val="Título de la tabla (user)"/>
+    <w:basedOn w:val="Contenidodelatablauser"/>
     <w:qFormat/>
     <w:pPr>
       <w:suppressLineNumbers/>
@@ -4048,8 +3983,8 @@
       <w:bCs/>
     </w:rPr>
   </w:style>
-  <w:style w:type="numbering" w:styleId="Ningunalistauser" w:default="1">
-    <w:name w:val="Ninguna lista (user)"/>
+  <w:style w:type="numbering" w:styleId="Ningunalista" w:default="1">
+    <w:name w:val="Ninguna lista"/>
     <w:uiPriority w:val="99"/>
     <w:semiHidden/>
     <w:unhideWhenUsed/>

</xml_diff>